<commit_message>
Close out 0.2.4, the release that carries 0.2.3's DOIs
Version 0.2.4, released 2026-09-26. PUBLISHING.md records mLOS 0.2.3,
10.5281/zenodo.22971450, and what a 409 from the Zenodo webhook means.
The presentation guide's Word export is rebuilt at its new stamp.

Assisted-by: Claude Opus 5 <noreply@anthropic.com>
</commit_message>
<xml_diff>
--- a/presentation_guide.docx
+++ b/presentation_guide.docx
@@ -32,7 +32,7 @@
         <w:rPr>
           <w:i/>
         </w:rPr>
-        <w:t xml:space="preserve">presentation guide, version 20260924_001. Read it in any markdown reader,</w:t>
+        <w:t xml:space="preserve">presentation guide, version 20260926_001. Read it in any markdown reader,</w:t>
       </w:r>
       <w:r>
         <w:rPr>
@@ -141,7 +141,7 @@
         <w:rPr>
           <w:i/>
         </w:rPr>
-        <w:t xml:space="preserve">at commit cc83eaf (2026-09-24). Where that is not the newest commit touching the file, this Word copy is behind it.</w:t>
+        <w:t xml:space="preserve">at commit 1a5268f (2026-09-26). Where that is not the newest commit touching the file, this Word copy is behind it.</w:t>
       </w:r>
     </w:p>
     <w:p>
@@ -2170,7 +2170,7 @@
           <w:rPr>
             <w:rStyle w:val="Hyperlink"/>
           </w:rPr>
-          <w:t xml:space="preserve">10.5281/zenodo.22652329</w:t>
+          <w:t xml:space="preserve">10.5281/zenodo.22971252</w:t>
         </w:r>
       </w:hyperlink>
       <w:r>

</xml_diff>